<commit_message>
List repeated paragraph openings, and plant the 1.1 test problems
doc_stats.py now lists each opening that starts three or more
paragraphs: a linking phrase up to its comma, or else the first three
words. Four new unit tests cover it.

The samples get the problems the 1.1 rules must catch: "In addition,"
opening three paragraphs (RP20), pointers to "earlier studies" that
name no work (RP21, TH19), metaphors for what a machine or a model did
(RP22, TH18) and closing comments on what a result means (RP23, TH20).
New sentences sit inside existing paragraphs, so every earlier place
and paragraph number still holds. planted.md and tests/expected say
what human-write and doc-check must do with them.

Co-Authored-By: Claude Opus 5.5 <noreply@anthropic.com>
Claude-Session: https://claude.ai/code/session_01XQRQzMvXiR24Ri6XgFTk9w
</commit_message>
<xml_diff>
--- a/samples/report/built/report.docx
+++ b/samples/report/built/report.docx
@@ -71,7 +71,7 @@
     </w:p>
     <w:p>
       <w:r>
-        <w:t xml:space="preserve">The company has also set itself a target to halve its packaging waste by 2030. Boxes are by far the largest part of that waste.</w:t>
+        <w:t xml:space="preserve">In addition, the company has set itself a target to halve its packaging waste by 2030. Boxes are by far the largest part of that waste.</w:t>
       </w:r>
     </w:p>
     <w:p>
@@ -360,7 +360,7 @@
     </w:tbl>
     <w:p>
       <w:r>
-        <w:t xml:space="preserve">The cost per order fell a little each month as the washing team got faster. It was $1.05 in September, $0.97 in October and $0.93 in November.</w:t>
+        <w:t xml:space="preserve">The cost per order fell a little each month as the washing team got faster. It was $1.05 in September, $0.97 in October and $0.93 in November. This result shows the wider promise of reuse for the whole business.</w:t>
       </w:r>
     </w:p>
     <w:p>
@@ -378,7 +378,7 @@
     </w:p>
     <w:p>
       <w:r>
-        <w:t xml:space="preserve">Customers returned 96% of crates within 30 days, and most came back with the next delivery. The other 4% were counted as lost. The deposits we kept covered a little over half of the cost of replacing them.</w:t>
+        <w:t xml:space="preserve">Customers returned 96% of crates within 30 days, and most came back with the next delivery. The other 4% were counted as lost. The deposits we kept covered a little over half of the cost of replacing them. On the first Monday, the washing station choked on a whole weekend of returned crates.</w:t>
       </w:r>
     </w:p>
     <w:p>
@@ -388,7 +388,7 @@
     </w:p>
     <w:p>
       <w:r>
-        <w:t xml:space="preserve">Damage was lower than we expected. By the end of the pilot, 3% of crates had cracked sides or broken lids, and the supplier replaced all of them under the supply agreement.</w:t>
+        <w:t xml:space="preserve">In addition, damage was lower than we expected. By the end of the pilot, 3% of crates had cracked sides or broken lids, and the supplier replaced all of them under the supply agreement.</w:t>
       </w:r>
     </w:p>
     <w:p>
@@ -457,7 +457,7 @@
     </w:p>
     <w:p>
       <w:r>
-        <w:t xml:space="preserve">The second risk is washing capacity. The leased station at Eastside ran at about 70% of its capacity. The larger depots would need bigger stations or a second washing shift. Washing also uses water: the Eastside station used about 1.2 liters per crate.</w:t>
+        <w:t xml:space="preserve">The second risk is washing capacity. The leased station at Eastside ran at about 70% of its capacity. The larger depots would need bigger stations or a second washing shift. Washing also uses water: the Eastside station used about 1.2 liters per crate. Earlier studies found that washing uses less water than making new boxes.</w:t>
       </w:r>
     </w:p>
     <w:p>
@@ -530,7 +530,7 @@
     </w:p>
     <w:p>
       <w:r>
-        <w:t xml:space="preserve">The team will also test a crate that folds flat at Eastside from April, to answer the complaints about storage space. We will report the loss rate, the cost per order and customer feedback to the board each month for the first six months.</w:t>
+        <w:t xml:space="preserve">In addition, the team will test a crate that folds flat at Eastside from April, to answer the complaints about storage space. We will report the loss rate, the cost per order and customer feedback to the board each month for the first six months.</w:t>
       </w:r>
     </w:p>
     <w:sectPr>

</xml_diff>